<commit_message>
Changed terminology to match book for clarity and added direction from book into Standards document.
</commit_message>
<xml_diff>
--- a/01_Standards/Milestone_4_Interfaces_and_Data_Structures/M4_Class_Diagram_Standards.docx
+++ b/01_Standards/Milestone_4_Interfaces_and_Data_Structures/M4_Class_Diagram_Standards.docx
@@ -4,7 +4,15 @@
   <w:body>
     <w:p>
       <w:r>
-        <w:t>Use drawio (</w:t>
+        <w:t xml:space="preserve">Use </w:t>
+      </w:r>
+      <w:proofErr w:type="spellStart"/>
+      <w:r>
+        <w:t>drawio</w:t>
+      </w:r>
+      <w:proofErr w:type="spellEnd"/>
+      <w:r>
+        <w:t xml:space="preserve"> (</w:t>
       </w:r>
       <w:hyperlink r:id="rId4" w:history="1">
         <w:r>
@@ -137,7 +145,41 @@
           <w:rFonts w:eastAsia="Times New Roman"/>
           <w:lang w:eastAsia="en-US"/>
         </w:rPr>
-        <w:t>Click on the table icon at the top,check "Title" box, and hover over 2 single boxes and click on the second to create a table shape.</w:t>
+        <w:t xml:space="preserve">Click on the table icon at the </w:t>
+      </w:r>
+      <w:proofErr w:type="spellStart"/>
+      <w:proofErr w:type="gramStart"/>
+      <w:r>
+        <w:rPr>
+          <w:rFonts w:eastAsia="Times New Roman"/>
+          <w:lang w:eastAsia="en-US"/>
+        </w:rPr>
+        <w:t>top,check</w:t>
+      </w:r>
+      <w:proofErr w:type="spellEnd"/>
+      <w:proofErr w:type="gramEnd"/>
+      <w:r>
+        <w:rPr>
+          <w:rFonts w:eastAsia="Times New Roman"/>
+          <w:lang w:eastAsia="en-US"/>
+        </w:rPr>
+        <w:t xml:space="preserve"> "Title" </w:t>
+      </w:r>
+      <w:proofErr w:type="gramStart"/>
+      <w:r>
+        <w:rPr>
+          <w:rFonts w:eastAsia="Times New Roman"/>
+          <w:lang w:eastAsia="en-US"/>
+        </w:rPr>
+        <w:t>box, and</w:t>
+      </w:r>
+      <w:proofErr w:type="gramEnd"/>
+      <w:r>
+        <w:rPr>
+          <w:rFonts w:eastAsia="Times New Roman"/>
+          <w:lang w:eastAsia="en-US"/>
+        </w:rPr>
+        <w:t xml:space="preserve"> hover over 2 single boxes and click on the second to create a table shape.</w:t>
       </w:r>
       <w:r>
         <w:rPr>
@@ -1271,7 +1313,23 @@
           <w:rFonts w:eastAsia="Times New Roman"/>
           <w:lang w:eastAsia="en-US"/>
         </w:rPr>
-        <w:t>Make the text left aligned.</w:t>
+        <w:t xml:space="preserve">Make the </w:t>
+      </w:r>
+      <w:proofErr w:type="gramStart"/>
+      <w:r>
+        <w:rPr>
+          <w:rFonts w:eastAsia="Times New Roman"/>
+          <w:lang w:eastAsia="en-US"/>
+        </w:rPr>
+        <w:t>text left</w:t>
+      </w:r>
+      <w:proofErr w:type="gramEnd"/>
+      <w:r>
+        <w:rPr>
+          <w:rFonts w:eastAsia="Times New Roman"/>
+          <w:lang w:eastAsia="en-US"/>
+        </w:rPr>
+        <w:t xml:space="preserve"> aligned.</w:t>
       </w:r>
     </w:p>
     <w:p>
@@ -1286,7 +1344,23 @@
           <w:rFonts w:eastAsia="Times New Roman"/>
           <w:lang w:eastAsia="en-US"/>
         </w:rPr>
-        <w:t>Put a space before the Class Name.</w:t>
+        <w:t xml:space="preserve">Put </w:t>
+      </w:r>
+      <w:proofErr w:type="gramStart"/>
+      <w:r>
+        <w:rPr>
+          <w:rFonts w:eastAsia="Times New Roman"/>
+          <w:lang w:eastAsia="en-US"/>
+        </w:rPr>
+        <w:t>a space</w:t>
+      </w:r>
+      <w:proofErr w:type="gramEnd"/>
+      <w:r>
+        <w:rPr>
+          <w:rFonts w:eastAsia="Times New Roman"/>
+          <w:lang w:eastAsia="en-US"/>
+        </w:rPr>
+        <w:t xml:space="preserve"> before the Class Name.</w:t>
       </w:r>
     </w:p>
     <w:p>
@@ -1436,12 +1510,21 @@
           <w:lang w:eastAsia="en-US"/>
         </w:rPr>
       </w:pPr>
+      <w:proofErr w:type="spellStart"/>
       <w:r>
         <w:rPr>
           <w:rFonts w:eastAsia="Times New Roman"/>
           <w:lang w:eastAsia="en-US"/>
         </w:rPr>
-        <w:t>Drawio UML</w:t>
+        <w:t>Drawio</w:t>
+      </w:r>
+      <w:proofErr w:type="spellEnd"/>
+      <w:r>
+        <w:rPr>
+          <w:rFonts w:eastAsia="Times New Roman"/>
+          <w:lang w:eastAsia="en-US"/>
+        </w:rPr>
+        <w:t xml:space="preserve"> UML</w:t>
       </w:r>
       <w:r>
         <w:rPr>
@@ -1740,7 +1823,19 @@
         <w:rPr>
           <w:lang w:eastAsia="en-US"/>
         </w:rPr>
-        <w:t xml:space="preserve">Change line thickness to 2pt, the symbol size to 40pt, add the numerosity via text box with the same </w:t>
+        <w:t xml:space="preserve">Change line thickness to 2pt, the symbol size to 40pt, add the </w:t>
+      </w:r>
+      <w:r>
+        <w:rPr>
+          <w:lang w:eastAsia="en-US"/>
+        </w:rPr>
+        <w:t>multiplic</w:t>
+      </w:r>
+      <w:r>
+        <w:rPr>
+          <w:lang w:eastAsia="en-US"/>
+        </w:rPr>
+        <w:t xml:space="preserve">ity via text box with the same </w:t>
       </w:r>
       <w:r>
         <w:rPr>
@@ -2248,7 +2343,13 @@
         <w:rPr>
           <w:lang w:eastAsia="en-US"/>
         </w:rPr>
-        <w:t xml:space="preserve"> &amp; no numerosity</w:t>
+        <w:t xml:space="preserve"> &amp; no </w:t>
+      </w:r>
+      <w:r>
+        <w:rPr>
+          <w:lang w:eastAsia="en-US"/>
+        </w:rPr>
+        <w:t>multiplicity</w:t>
       </w:r>
       <w:r>
         <w:rPr>
@@ -2815,7 +2916,19 @@
         <w:rPr>
           <w:lang w:eastAsia="en-US"/>
         </w:rPr>
-        <w:t xml:space="preserve">Change line thickness to 2pt, the symbol size to 32pt, add the numerosity via text box with the same </w:t>
+        <w:t xml:space="preserve">Change line thickness to 2pt, the symbol size to 32pt, add the </w:t>
+      </w:r>
+      <w:r>
+        <w:rPr>
+          <w:lang w:eastAsia="en-US"/>
+        </w:rPr>
+        <w:t>multiplicity</w:t>
+      </w:r>
+      <w:r>
+        <w:rPr>
+          <w:lang w:eastAsia="en-US"/>
+        </w:rPr>
+        <w:t xml:space="preserve"> via text box with the same </w:t>
       </w:r>
       <w:r>
         <w:rPr>
@@ -3152,7 +3265,21 @@
               <w:rPr>
                 <w:highlight w:val="green"/>
               </w:rPr>
-              <w:t>one class is defined within another class.</w:t>
+              <w:t xml:space="preserve">one </w:t>
+            </w:r>
+            <w:proofErr w:type="gramStart"/>
+            <w:r>
+              <w:rPr>
+                <w:highlight w:val="green"/>
+              </w:rPr>
+              <w:t>class</w:t>
+            </w:r>
+            <w:proofErr w:type="gramEnd"/>
+            <w:r>
+              <w:rPr>
+                <w:highlight w:val="green"/>
+              </w:rPr>
+              <w:t xml:space="preserve"> is defined within another class.</w:t>
             </w:r>
           </w:p>
         </w:tc>
@@ -3326,6 +3453,429 @@
     </w:p>
     <w:p>
       <w:pPr>
+        <w:rPr>
+          <w:b/>
+          <w:bCs/>
+          <w:color w:val="156082" w:themeColor="accent1"/>
+        </w:rPr>
+      </w:pPr>
+      <w:r>
+        <w:rPr>
+          <w:b/>
+          <w:bCs/>
+          <w:color w:val="156082" w:themeColor="accent1"/>
+        </w:rPr>
+        <w:t>Multiplicity</w:t>
+      </w:r>
+    </w:p>
+    <w:p>
+      <w:r>
+        <w:t xml:space="preserve">Though not required, it is </w:t>
+      </w:r>
+      <w:r>
+        <w:rPr>
+          <w:highlight w:val="yellow"/>
+        </w:rPr>
+        <w:t>helpful to include</w:t>
+      </w:r>
+      <w:r>
+        <w:t xml:space="preserve"> the </w:t>
+      </w:r>
+      <w:r>
+        <w:rPr>
+          <w:highlight w:val="green"/>
+        </w:rPr>
+        <w:t>number of instances of the attribute</w:t>
+      </w:r>
+      <w:r>
+        <w:t xml:space="preserve">, </w:t>
+      </w:r>
+      <w:r>
+        <w:rPr>
+          <w:highlight w:val="yellow"/>
+        </w:rPr>
+        <w:t>called multiplicity</w:t>
+      </w:r>
+      <w:r>
+        <w:t xml:space="preserve">. This can be a </w:t>
+      </w:r>
+      <w:r>
+        <w:rPr>
+          <w:highlight w:val="green"/>
+        </w:rPr>
+        <w:t>single number or a range</w:t>
+      </w:r>
+      <w:r>
+        <w:t xml:space="preserve">. We can also indicate an </w:t>
+      </w:r>
+      <w:r>
+        <w:rPr>
+          <w:highlight w:val="green"/>
+        </w:rPr>
+        <w:t>indefinite number of instances</w:t>
+      </w:r>
+      <w:r>
+        <w:t xml:space="preserve"> with an </w:t>
+      </w:r>
+      <w:r>
+        <w:rPr>
+          <w:highlight w:val="yellow"/>
+        </w:rPr>
+        <w:t>asterisk</w:t>
+      </w:r>
+      <w:r>
+        <w:t xml:space="preserve">. Sometimes </w:t>
+      </w:r>
+      <w:proofErr w:type="gramStart"/>
+      <w:r>
+        <w:t>the multiplicity</w:t>
+      </w:r>
+      <w:proofErr w:type="gramEnd"/>
+      <w:r>
+        <w:t xml:space="preserve"> can be inferred from the rest of the class diagram, so adding multiplicity information is not helpful. Most often, however, </w:t>
+      </w:r>
+      <w:r>
+        <w:rPr>
+          <w:highlight w:val="yellow"/>
+        </w:rPr>
+        <w:t>explicitly stating multiplicity</w:t>
+      </w:r>
+      <w:r>
+        <w:t xml:space="preserve"> </w:t>
+      </w:r>
+      <w:r>
+        <w:rPr>
+          <w:highlight w:val="green"/>
+        </w:rPr>
+        <w:t>adds clarity</w:t>
+      </w:r>
+      <w:r>
+        <w:t>.</w:t>
+      </w:r>
+    </w:p>
+    <w:p/>
+    <w:p>
+      <w:pPr>
+        <w:rPr>
+          <w:b/>
+          <w:bCs/>
+          <w:color w:val="156082" w:themeColor="accent1"/>
+        </w:rPr>
+        <w:sectPr>
+          <w:headerReference w:type="default" r:id="rId42"/>
+          <w:type w:val="continuous"/>
+          <w:pgSz w:w="12240" w:h="15840"/>
+          <w:pgMar w:top="1440" w:right="1440" w:bottom="1440" w:left="1440" w:header="720" w:footer="720" w:gutter="0"/>
+          <w:cols w:space="720"/>
+          <w:docGrid w:linePitch="360"/>
+        </w:sectPr>
+      </w:pPr>
+    </w:p>
+    <w:tbl>
+      <w:tblPr>
+        <w:tblStyle w:val="TableGrid"/>
+        <w:tblW w:w="0" w:type="auto"/>
+        <w:tblBorders>
+          <w:top w:val="single" w:sz="12" w:space="0" w:color="0070C0"/>
+          <w:left w:val="none" w:sz="0" w:space="0" w:color="auto"/>
+          <w:bottom w:val="single" w:sz="12" w:space="0" w:color="0070C0"/>
+          <w:right w:val="none" w:sz="0" w:space="0" w:color="auto"/>
+          <w:insideH w:val="none" w:sz="0" w:space="0" w:color="auto"/>
+          <w:insideV w:val="none" w:sz="0" w:space="0" w:color="auto"/>
+        </w:tblBorders>
+        <w:tblLook w:val="04A0" w:firstRow="1" w:lastRow="0" w:firstColumn="1" w:lastColumn="0" w:noHBand="0" w:noVBand="1"/>
+      </w:tblPr>
+      <w:tblGrid>
+        <w:gridCol w:w="899"/>
+        <w:gridCol w:w="3421"/>
+      </w:tblGrid>
+      <w:tr>
+        <w:tc>
+          <w:tcPr>
+            <w:tcW w:w="0" w:type="auto"/>
+          </w:tcPr>
+          <w:p>
+            <w:pPr>
+              <w:rPr>
+                <w:b/>
+                <w:bCs/>
+                <w:color w:val="156082" w:themeColor="accent1"/>
+              </w:rPr>
+            </w:pPr>
+            <w:r>
+              <w:rPr>
+                <w:b/>
+                <w:bCs/>
+                <w:color w:val="156082" w:themeColor="accent1"/>
+              </w:rPr>
+              <w:t>5</w:t>
+            </w:r>
+          </w:p>
+        </w:tc>
+        <w:tc>
+          <w:tcPr>
+            <w:tcW w:w="0" w:type="auto"/>
+          </w:tcPr>
+          <w:p>
+            <w:r>
+              <w:t>A fixed number of five instances</w:t>
+            </w:r>
+          </w:p>
+        </w:tc>
+      </w:tr>
+      <w:tr>
+        <w:tc>
+          <w:tcPr>
+            <w:tcW w:w="0" w:type="auto"/>
+          </w:tcPr>
+          <w:p>
+            <w:pPr>
+              <w:rPr>
+                <w:b/>
+                <w:bCs/>
+                <w:color w:val="156082" w:themeColor="accent1"/>
+              </w:rPr>
+            </w:pPr>
+            <w:r>
+              <w:rPr>
+                <w:b/>
+                <w:bCs/>
+                <w:color w:val="156082" w:themeColor="accent1"/>
+              </w:rPr>
+              <w:t>0 ... 1</w:t>
+            </w:r>
+          </w:p>
+        </w:tc>
+        <w:tc>
+          <w:tcPr>
+            <w:tcW w:w="0" w:type="auto"/>
+          </w:tcPr>
+          <w:p>
+            <w:r>
+              <w:t>Zero or one instance</w:t>
+            </w:r>
+          </w:p>
+        </w:tc>
+      </w:tr>
+      <w:tr>
+        <w:tc>
+          <w:tcPr>
+            <w:tcW w:w="0" w:type="auto"/>
+          </w:tcPr>
+          <w:p>
+            <w:pPr>
+              <w:rPr>
+                <w:b/>
+                <w:bCs/>
+                <w:color w:val="156082" w:themeColor="accent1"/>
+              </w:rPr>
+            </w:pPr>
+            <w:r>
+              <w:rPr>
+                <w:b/>
+                <w:bCs/>
+                <w:color w:val="156082" w:themeColor="accent1"/>
+              </w:rPr>
+              <w:t>6 ... 10</w:t>
+            </w:r>
+          </w:p>
+        </w:tc>
+        <w:tc>
+          <w:tcPr>
+            <w:tcW w:w="0" w:type="auto"/>
+          </w:tcPr>
+          <w:p>
+            <w:r>
+              <w:t>Between six and ten instances</w:t>
+            </w:r>
+          </w:p>
+        </w:tc>
+      </w:tr>
+      <w:tr>
+        <w:tc>
+          <w:tcPr>
+            <w:tcW w:w="0" w:type="auto"/>
+          </w:tcPr>
+          <w:p>
+            <w:pPr>
+              <w:rPr>
+                <w:b/>
+                <w:bCs/>
+                <w:color w:val="156082" w:themeColor="accent1"/>
+              </w:rPr>
+            </w:pPr>
+            <w:r>
+              <w:rPr>
+                <w:b/>
+                <w:bCs/>
+                <w:color w:val="156082" w:themeColor="accent1"/>
+              </w:rPr>
+              <w:t>*</w:t>
+            </w:r>
+          </w:p>
+        </w:tc>
+        <w:tc>
+          <w:tcPr>
+            <w:tcW w:w="0" w:type="auto"/>
+          </w:tcPr>
+          <w:p>
+            <w:r>
+              <w:t>Zero or more instances</w:t>
+            </w:r>
+          </w:p>
+        </w:tc>
+      </w:tr>
+    </w:tbl>
+    <w:p>
+      <w:pPr>
+        <w:rPr>
+          <w:sz w:val="16"/>
+          <w:szCs w:val="16"/>
+        </w:rPr>
+      </w:pPr>
+      <w:r>
+        <w:rPr>
+          <w:sz w:val="16"/>
+          <w:szCs w:val="16"/>
+        </w:rPr>
+        <w:t xml:space="preserve">                   </w:t>
+      </w:r>
+      <w:r>
+        <w:rPr>
+          <w:sz w:val="16"/>
+          <w:szCs w:val="16"/>
+        </w:rPr>
+        <w:t>Table 3.0.6: Different forms of multiplicity</w:t>
+      </w:r>
+    </w:p>
+    <w:p>
+      <w:pPr>
+        <w:jc w:val="center"/>
+        <w:rPr>
+          <w:sz w:val="16"/>
+          <w:szCs w:val="16"/>
+        </w:rPr>
+      </w:pPr>
+    </w:p>
+    <w:p>
+      <w:pPr>
+        <w:jc w:val="center"/>
+        <w:rPr>
+          <w:b/>
+          <w:bCs/>
+          <w:color w:val="156082" w:themeColor="accent1"/>
+        </w:rPr>
+      </w:pPr>
+      <w:r>
+        <w:rPr>
+          <w:noProof/>
+        </w:rPr>
+        <w:drawing>
+          <wp:inline distT="0" distB="0" distL="0" distR="0" wp14:anchorId="3049E386" wp14:editId="1DAA514A">
+            <wp:extent cx="2162175" cy="400050"/>
+            <wp:effectExtent l="0" t="0" r="9525" b="0"/>
+            <wp:docPr id="1499829670" name="Picture 1"/>
+            <wp:cNvGraphicFramePr>
+              <a:graphicFrameLocks xmlns:a="http://schemas.openxmlformats.org/drawingml/2006/main" noChangeAspect="1"/>
+            </wp:cNvGraphicFramePr>
+            <a:graphic xmlns:a="http://schemas.openxmlformats.org/drawingml/2006/main">
+              <a:graphicData uri="http://schemas.openxmlformats.org/drawingml/2006/picture">
+                <pic:pic xmlns:pic="http://schemas.openxmlformats.org/drawingml/2006/picture">
+                  <pic:nvPicPr>
+                    <pic:cNvPr id="2025634532" name=""/>
+                    <pic:cNvPicPr/>
+                  </pic:nvPicPr>
+                  <pic:blipFill>
+                    <a:blip r:embed="rId43"/>
+                    <a:stretch>
+                      <a:fillRect/>
+                    </a:stretch>
+                  </pic:blipFill>
+                  <pic:spPr>
+                    <a:xfrm>
+                      <a:off x="0" y="0"/>
+                      <a:ext cx="2162175" cy="400050"/>
+                    </a:xfrm>
+                    <a:prstGeom prst="rect">
+                      <a:avLst/>
+                    </a:prstGeom>
+                  </pic:spPr>
+                </pic:pic>
+              </a:graphicData>
+            </a:graphic>
+          </wp:inline>
+        </w:drawing>
+      </w:r>
+    </w:p>
+    <w:p>
+      <w:pPr>
+        <w:jc w:val="center"/>
+        <w:rPr>
+          <w:sz w:val="16"/>
+          <w:szCs w:val="16"/>
+        </w:rPr>
+      </w:pPr>
+      <w:r>
+        <w:rPr>
+          <w:sz w:val="16"/>
+          <w:szCs w:val="16"/>
+        </w:rPr>
+        <w:t>Figure 3.0.7: Composition with multiplicity</w:t>
+      </w:r>
+    </w:p>
+    <w:p>
+      <w:pPr>
+        <w:jc w:val="center"/>
+        <w:rPr>
+          <w:sz w:val="16"/>
+          <w:szCs w:val="16"/>
+        </w:rPr>
+      </w:pPr>
+    </w:p>
+    <w:p>
+      <w:pPr>
+        <w:jc w:val="center"/>
+        <w:rPr>
+          <w:sz w:val="16"/>
+          <w:szCs w:val="16"/>
+        </w:rPr>
+      </w:pPr>
+    </w:p>
+    <w:p>
+      <w:pPr>
+        <w:jc w:val="center"/>
+        <w:rPr>
+          <w:sz w:val="16"/>
+          <w:szCs w:val="16"/>
+        </w:rPr>
+        <w:sectPr>
+          <w:type w:val="continuous"/>
+          <w:pgSz w:w="12240" w:h="15840"/>
+          <w:pgMar w:top="1440" w:right="1440" w:bottom="1440" w:left="1440" w:header="720" w:footer="720" w:gutter="0"/>
+          <w:cols w:num="2" w:space="0" w:equalWidth="0">
+            <w:col w:w="5040" w:space="0"/>
+            <w:col w:w="4320"/>
+          </w:cols>
+          <w:docGrid w:linePitch="360"/>
+        </w:sectPr>
+      </w:pPr>
+    </w:p>
+    <w:p>
+      <w:pPr>
+        <w:sectPr>
+          <w:type w:val="continuous"/>
+          <w:pgSz w:w="12240" w:h="15840"/>
+          <w:pgMar w:top="1440" w:right="1440" w:bottom="1440" w:left="1440" w:header="720" w:footer="720" w:gutter="0"/>
+          <w:cols w:num="2" w:space="0" w:equalWidth="0">
+            <w:col w:w="6120" w:space="0"/>
+            <w:col w:w="3240"/>
+          </w:cols>
+          <w:docGrid w:linePitch="360"/>
+        </w:sectPr>
+      </w:pPr>
+    </w:p>
+    <w:p>
+      <w:pPr>
         <w:pStyle w:val="GitHubProcesses"/>
         <w:rPr>
           <w:lang w:eastAsia="en-US"/>
@@ -3335,6 +3885,7 @@
         <w:rPr>
           <w:lang w:eastAsia="en-US"/>
         </w:rPr>
+        <w:lastRenderedPageBreak/>
         <w:t>Word Document Deliverable</w:t>
       </w:r>
     </w:p>
@@ -3365,10 +3916,7 @@
         <w:t>-</w:t>
       </w:r>
       <w:r>
-        <w:t>CD &lt;Primary Class Name&gt;</w:t>
-      </w:r>
-      <w:r>
-        <w:t xml:space="preserve"> Class Diagram</w:t>
+        <w:t>CD &lt;Primary Class Name&gt; Class Diagram</w:t>
       </w:r>
       <w:r>
         <w:t xml:space="preserve"> </w:t>
@@ -3452,6 +4000,110 @@
     </w:sectPr>
   </w:body>
 </w:document>
+</file>
+
+<file path=word/header1.xml><?xml version="1.0" encoding="utf-8"?>
+<w:hdr xmlns:wpc="http://schemas.microsoft.com/office/word/2010/wordprocessingCanvas" xmlns:cx="http://schemas.microsoft.com/office/drawing/2014/chartex" xmlns:cx1="http://schemas.microsoft.com/office/drawing/2015/9/8/chartex" xmlns:cx2="http://schemas.microsoft.com/office/drawing/2015/10/21/chartex" xmlns:cx3="http://schemas.microsoft.com/office/drawing/2016/5/9/chartex" xmlns:cx4="http://schemas.microsoft.com/office/drawing/2016/5/10/chartex" xmlns:cx5="http://schemas.microsoft.com/office/drawing/2016/5/11/chartex" xmlns:cx6="http://schemas.microsoft.com/office/drawing/2016/5/12/chartex" xmlns:cx7="http://schemas.microsoft.com/office/drawing/2016/5/13/chartex" xmlns:cx8="http://schemas.microsoft.com/office/drawing/2016/5/14/chartex" xmlns:mc="http://schemas.openxmlformats.org/markup-compatibility/2006" xmlns:aink="http://schemas.microsoft.com/office/drawing/2016/ink" xmlns:am3d="http://schemas.microsoft.com/office/drawing/2017/model3d" xmlns:o="urn:schemas-microsoft-com:office:office" xmlns:oel="http://schemas.microsoft.com/office/2019/extlst" xmlns:r="http://schemas.openxmlformats.org/officeDocument/2006/relationships" xmlns:m="http://schemas.openxmlformats.org/officeDocument/2006/math" xmlns:v="urn:schemas-microsoft-com:vml" xmlns:wp14="http://schemas.microsoft.com/office/word/2010/wordprocessingDrawing" xmlns:wp="http://schemas.openxmlformats.org/drawingml/2006/wordprocessingDrawing" xmlns:w10="urn:schemas-microsoft-com:office:word" xmlns:w="http://schemas.openxmlformats.org/wordprocessingml/2006/main" xmlns:w14="http://schemas.microsoft.com/office/word/2010/wordml" xmlns:w15="http://schemas.microsoft.com/office/word/2012/wordml" xmlns:w16cex="http://schemas.microsoft.com/office/word/2018/wordml/cex" xmlns:w16cid="http://schemas.microsoft.com/office/word/2016/wordml/cid" xmlns:w16="http://schemas.microsoft.com/office/word/2018/wordml" xmlns:w16du="http://schemas.microsoft.com/office/word/2023/wordml/word16du" xmlns:w16sdtdh="http://schemas.microsoft.com/office/word/2020/wordml/sdtdatahash" xmlns:w16sdtfl="http://schemas.microsoft.com/office/word/2024/wordml/sdtformatlock" xmlns:w16se="http://schemas.microsoft.com/office/word/2015/wordml/symex" xmlns:wpg="http://schemas.microsoft.com/office/word/2010/wordprocessingGroup" xmlns:wpi="http://schemas.microsoft.com/office/word/2010/wordprocessingInk" xmlns:wne="http://schemas.microsoft.com/office/word/2006/wordml" xmlns:wps="http://schemas.microsoft.com/office/word/2010/wordprocessingShape" mc:Ignorable="w14 w15 w16se w16cid w16 w16cex w16sdtdh w16sdtfl w16du wp14">
+  <w:sdt>
+    <w:sdtPr>
+      <w:id w:val="98381352"/>
+      <w:docPartObj>
+        <w:docPartGallery w:val="Page Numbers (Top of Page)"/>
+        <w:docPartUnique/>
+      </w:docPartObj>
+    </w:sdtPr>
+    <w:sdtContent>
+      <w:p>
+        <w:pPr>
+          <w:pStyle w:val="Header"/>
+        </w:pPr>
+        <w:r>
+          <w:t xml:space="preserve">Page </w:t>
+        </w:r>
+        <w:r>
+          <w:rPr>
+            <w:b/>
+            <w:bCs/>
+          </w:rPr>
+          <w:fldChar w:fldCharType="begin"/>
+        </w:r>
+        <w:r>
+          <w:rPr>
+            <w:b/>
+            <w:bCs/>
+          </w:rPr>
+          <w:instrText xml:space="preserve"> PAGE </w:instrText>
+        </w:r>
+        <w:r>
+          <w:rPr>
+            <w:b/>
+            <w:bCs/>
+          </w:rPr>
+          <w:fldChar w:fldCharType="separate"/>
+        </w:r>
+        <w:r>
+          <w:rPr>
+            <w:b/>
+            <w:bCs/>
+            <w:noProof/>
+          </w:rPr>
+          <w:t>2</w:t>
+        </w:r>
+        <w:r>
+          <w:rPr>
+            <w:b/>
+            <w:bCs/>
+          </w:rPr>
+          <w:fldChar w:fldCharType="end"/>
+        </w:r>
+        <w:r>
+          <w:t xml:space="preserve"> of </w:t>
+        </w:r>
+        <w:r>
+          <w:rPr>
+            <w:b/>
+            <w:bCs/>
+          </w:rPr>
+          <w:fldChar w:fldCharType="begin"/>
+        </w:r>
+        <w:r>
+          <w:rPr>
+            <w:b/>
+            <w:bCs/>
+          </w:rPr>
+          <w:instrText xml:space="preserve"> NUMPAGES  </w:instrText>
+        </w:r>
+        <w:r>
+          <w:rPr>
+            <w:b/>
+            <w:bCs/>
+          </w:rPr>
+          <w:fldChar w:fldCharType="separate"/>
+        </w:r>
+        <w:r>
+          <w:rPr>
+            <w:b/>
+            <w:bCs/>
+            <w:noProof/>
+          </w:rPr>
+          <w:t>2</w:t>
+        </w:r>
+        <w:r>
+          <w:rPr>
+            <w:b/>
+            <w:bCs/>
+          </w:rPr>
+          <w:fldChar w:fldCharType="end"/>
+        </w:r>
+      </w:p>
+    </w:sdtContent>
+  </w:sdt>
+  <w:p>
+    <w:pPr>
+      <w:pStyle w:val="Header"/>
+    </w:pPr>
+  </w:p>
+</w:hdr>
 </file>
 
 <file path=word/styles.xml><?xml version="1.0" encoding="utf-8"?>
@@ -5403,6 +6055,32 @@
       <w:szCs w:val="20"/>
     </w:rPr>
   </w:style>
+  <w:style w:type="paragraph" w:styleId="Header">
+    <w:name w:val="header"/>
+    <w:basedOn w:val="Normal"/>
+    <w:link w:val="HeaderChar"/>
+    <w:uiPriority w:val="99"/>
+    <w:unhideWhenUsed/>
+    <w:rsid w:val="00CA45FC"/>
+    <w:pPr>
+      <w:tabs>
+        <w:tab w:val="center" w:pos="4680"/>
+        <w:tab w:val="right" w:pos="9360"/>
+      </w:tabs>
+      <w:spacing w:line="240" w:lineRule="auto"/>
+    </w:pPr>
+  </w:style>
+  <w:style w:type="character" w:customStyle="1" w:styleId="HeaderChar">
+    <w:name w:val="Header Char"/>
+    <w:basedOn w:val="DefaultParagraphFont"/>
+    <w:link w:val="Header"/>
+    <w:uiPriority w:val="99"/>
+    <w:rsid w:val="00CA45FC"/>
+    <w:rPr>
+      <w:rFonts w:eastAsiaTheme="minorEastAsia"/>
+      <w:lang w:eastAsia="ja-JP"/>
+    </w:rPr>
+  </w:style>
 </w:styles>
 </file>
 

</xml_diff>

<commit_message>
Updated Class Diagram Standards for Heading
</commit_message>
<xml_diff>
--- a/01_Standards/Milestone_4_Interfaces_and_Data_Structures/M4_Class_Diagram_Standards.docx
+++ b/01_Standards/Milestone_4_Interfaces_and_Data_Structures/M4_Class_Diagram_Standards.docx
@@ -14,7 +14,7 @@
       <w:r>
         <w:t xml:space="preserve"> (</w:t>
       </w:r>
-      <w:hyperlink r:id="rId4" w:history="1">
+      <w:hyperlink r:id="rId6" w:history="1">
         <w:r>
           <w:rPr>
             <w:rStyle w:val="Hyperlink"/>
@@ -224,7 +224,7 @@
                     <pic:cNvPicPr/>
                   </pic:nvPicPr>
                   <pic:blipFill>
-                    <a:blip r:embed="rId5">
+                    <a:blip r:embed="rId7">
                       <a:extLst>
                         <a:ext uri="{28A0092B-C50C-407E-A947-70E740481C1C}">
                           <a14:useLocalDpi xmlns:a14="http://schemas.microsoft.com/office/drawing/2010/main" val="0"/>
@@ -270,7 +270,7 @@
                     <pic:cNvPicPr/>
                   </pic:nvPicPr>
                   <pic:blipFill>
-                    <a:blip r:embed="rId6"/>
+                    <a:blip r:embed="rId8"/>
                     <a:stretch>
                       <a:fillRect/>
                     </a:stretch>
@@ -317,7 +317,7 @@
                     <pic:cNvPicPr/>
                   </pic:nvPicPr>
                   <pic:blipFill>
-                    <a:blip r:embed="rId7"/>
+                    <a:blip r:embed="rId9"/>
                     <a:stretch>
                       <a:fillRect/>
                     </a:stretch>
@@ -395,7 +395,7 @@
                     <pic:cNvPicPr/>
                   </pic:nvPicPr>
                   <pic:blipFill>
-                    <a:blip r:embed="rId8">
+                    <a:blip r:embed="rId10">
                       <a:extLst>
                         <a:ext uri="{28A0092B-C50C-407E-A947-70E740481C1C}">
                           <a14:useLocalDpi xmlns:a14="http://schemas.microsoft.com/office/drawing/2010/main" val="0"/>
@@ -447,7 +447,7 @@
                     <pic:cNvPicPr/>
                   </pic:nvPicPr>
                   <pic:blipFill>
-                    <a:blip r:embed="rId9"/>
+                    <a:blip r:embed="rId11"/>
                     <a:stretch>
                       <a:fillRect/>
                     </a:stretch>
@@ -495,7 +495,7 @@
                     <pic:cNvPicPr/>
                   </pic:nvPicPr>
                   <pic:blipFill>
-                    <a:blip r:embed="rId10"/>
+                    <a:blip r:embed="rId12"/>
                     <a:stretch>
                       <a:fillRect/>
                     </a:stretch>
@@ -569,7 +569,7 @@
                     <pic:cNvPicPr/>
                   </pic:nvPicPr>
                   <pic:blipFill>
-                    <a:blip r:embed="rId11"/>
+                    <a:blip r:embed="rId13"/>
                     <a:stretch>
                       <a:fillRect/>
                     </a:stretch>
@@ -623,7 +623,7 @@
                     <pic:cNvPicPr/>
                   </pic:nvPicPr>
                   <pic:blipFill rotWithShape="1">
-                    <a:blip r:embed="rId12"/>
+                    <a:blip r:embed="rId14"/>
                     <a:srcRect t="7125" b="6871"/>
                     <a:stretch>
                       <a:fillRect/>
@@ -714,7 +714,7 @@
                     <pic:cNvPicPr/>
                   </pic:nvPicPr>
                   <pic:blipFill>
-                    <a:blip r:embed="rId13">
+                    <a:blip r:embed="rId15">
                       <a:extLst>
                         <a:ext uri="{28A0092B-C50C-407E-A947-70E740481C1C}">
                           <a14:useLocalDpi xmlns:a14="http://schemas.microsoft.com/office/drawing/2010/main" val="0"/>
@@ -760,7 +760,7 @@
                     <pic:cNvPicPr/>
                   </pic:nvPicPr>
                   <pic:blipFill rotWithShape="1">
-                    <a:blip r:embed="rId14"/>
+                    <a:blip r:embed="rId16"/>
                     <a:srcRect t="3226" b="4838"/>
                     <a:stretch>
                       <a:fillRect/>
@@ -1434,7 +1434,7 @@
                     <pic:cNvPicPr/>
                   </pic:nvPicPr>
                   <pic:blipFill>
-                    <a:blip r:embed="rId15"/>
+                    <a:blip r:embed="rId17"/>
                     <a:stretch>
                       <a:fillRect/>
                     </a:stretch>
@@ -1481,7 +1481,7 @@
                     <pic:cNvPicPr/>
                   </pic:nvPicPr>
                   <pic:blipFill>
-                    <a:blip r:embed="rId16"/>
+                    <a:blip r:embed="rId18"/>
                     <a:stretch>
                       <a:fillRect/>
                     </a:stretch>
@@ -1640,7 +1640,7 @@
                     <pic:cNvPicPr/>
                   </pic:nvPicPr>
                   <pic:blipFill>
-                    <a:blip r:embed="rId17"/>
+                    <a:blip r:embed="rId19"/>
                     <a:stretch>
                       <a:fillRect/>
                     </a:stretch>
@@ -1700,7 +1700,7 @@
                     <pic:cNvPicPr/>
                   </pic:nvPicPr>
                   <pic:blipFill>
-                    <a:blip r:embed="rId18"/>
+                    <a:blip r:embed="rId20"/>
                     <a:stretch>
                       <a:fillRect/>
                     </a:stretch>
@@ -1746,7 +1746,7 @@
                     <pic:cNvPicPr/>
                   </pic:nvPicPr>
                   <pic:blipFill>
-                    <a:blip r:embed="rId19"/>
+                    <a:blip r:embed="rId21"/>
                     <a:stretch>
                       <a:fillRect/>
                     </a:stretch>
@@ -1792,7 +1792,7 @@
                     <pic:cNvPicPr/>
                   </pic:nvPicPr>
                   <pic:blipFill>
-                    <a:blip r:embed="rId20"/>
+                    <a:blip r:embed="rId22"/>
                     <a:stretch>
                       <a:fillRect/>
                     </a:stretch>
@@ -1871,7 +1871,7 @@
                     <pic:cNvPicPr/>
                   </pic:nvPicPr>
                   <pic:blipFill>
-                    <a:blip r:embed="rId21"/>
+                    <a:blip r:embed="rId23"/>
                     <a:stretch>
                       <a:fillRect/>
                     </a:stretch>
@@ -1917,7 +1917,7 @@
                     <pic:cNvPicPr/>
                   </pic:nvPicPr>
                   <pic:blipFill>
-                    <a:blip r:embed="rId22"/>
+                    <a:blip r:embed="rId24"/>
                     <a:stretch>
                       <a:fillRect/>
                     </a:stretch>
@@ -2031,7 +2031,7 @@
                     <pic:cNvPicPr/>
                   </pic:nvPicPr>
                   <pic:blipFill rotWithShape="1">
-                    <a:blip r:embed="rId23"/>
+                    <a:blip r:embed="rId25"/>
                     <a:srcRect l="4375" r="5983" b="4110"/>
                     <a:stretch>
                       <a:fillRect/>
@@ -2086,7 +2086,7 @@
                     <pic:cNvPicPr/>
                   </pic:nvPicPr>
                   <pic:blipFill>
-                    <a:blip r:embed="rId24"/>
+                    <a:blip r:embed="rId26"/>
                     <a:stretch>
                       <a:fillRect/>
                     </a:stretch>
@@ -2132,7 +2132,7 @@
                     <pic:cNvPicPr/>
                   </pic:nvPicPr>
                   <pic:blipFill rotWithShape="1">
-                    <a:blip r:embed="rId19"/>
+                    <a:blip r:embed="rId21"/>
                     <a:srcRect t="5241"/>
                     <a:stretch>
                       <a:fillRect/>
@@ -2187,7 +2187,7 @@
                     <pic:cNvPicPr/>
                   </pic:nvPicPr>
                   <pic:blipFill>
-                    <a:blip r:embed="rId25"/>
+                    <a:blip r:embed="rId27"/>
                     <a:stretch>
                       <a:fillRect/>
                     </a:stretch>
@@ -2234,7 +2234,7 @@
                     <pic:cNvPicPr/>
                   </pic:nvPicPr>
                   <pic:blipFill>
-                    <a:blip r:embed="rId26"/>
+                    <a:blip r:embed="rId28"/>
                     <a:stretch>
                       <a:fillRect/>
                     </a:stretch>
@@ -2280,7 +2280,7 @@
                     <pic:cNvPicPr/>
                   </pic:nvPicPr>
                   <pic:blipFill>
-                    <a:blip r:embed="rId27"/>
+                    <a:blip r:embed="rId29"/>
                     <a:stretch>
                       <a:fillRect/>
                     </a:stretch>
@@ -2384,7 +2384,7 @@
                     <pic:cNvPicPr/>
                   </pic:nvPicPr>
                   <pic:blipFill>
-                    <a:blip r:embed="rId28"/>
+                    <a:blip r:embed="rId30"/>
                     <a:stretch>
                       <a:fillRect/>
                     </a:stretch>
@@ -2430,7 +2430,7 @@
                     <pic:cNvPicPr/>
                   </pic:nvPicPr>
                   <pic:blipFill>
-                    <a:blip r:embed="rId29"/>
+                    <a:blip r:embed="rId31"/>
                     <a:stretch>
                       <a:fillRect/>
                     </a:stretch>
@@ -2476,7 +2476,7 @@
                     <pic:cNvPicPr/>
                   </pic:nvPicPr>
                   <pic:blipFill rotWithShape="1">
-                    <a:blip r:embed="rId19"/>
+                    <a:blip r:embed="rId21"/>
                     <a:srcRect t="5241"/>
                     <a:stretch>
                       <a:fillRect/>
@@ -2532,7 +2532,7 @@
                     <pic:cNvPicPr/>
                   </pic:nvPicPr>
                   <pic:blipFill>
-                    <a:blip r:embed="rId30"/>
+                    <a:blip r:embed="rId32"/>
                     <a:stretch>
                       <a:fillRect/>
                     </a:stretch>
@@ -2578,7 +2578,7 @@
                     <pic:cNvPicPr/>
                   </pic:nvPicPr>
                   <pic:blipFill>
-                    <a:blip r:embed="rId31"/>
+                    <a:blip r:embed="rId33"/>
                     <a:stretch>
                       <a:fillRect/>
                     </a:stretch>
@@ -2646,7 +2646,7 @@
                     <pic:cNvPicPr/>
                   </pic:nvPicPr>
                   <pic:blipFill>
-                    <a:blip r:embed="rId32"/>
+                    <a:blip r:embed="rId34"/>
                     <a:stretch>
                       <a:fillRect/>
                     </a:stretch>
@@ -2732,7 +2732,7 @@
                     <pic:cNvPicPr/>
                   </pic:nvPicPr>
                   <pic:blipFill>
-                    <a:blip r:embed="rId33"/>
+                    <a:blip r:embed="rId35"/>
                     <a:stretch>
                       <a:fillRect/>
                     </a:stretch>
@@ -2778,7 +2778,7 @@
                     <pic:cNvPicPr/>
                   </pic:nvPicPr>
                   <pic:blipFill rotWithShape="1">
-                    <a:blip r:embed="rId34"/>
+                    <a:blip r:embed="rId36"/>
                     <a:srcRect l="21256" r="15942"/>
                     <a:stretch>
                       <a:fillRect/>
@@ -2884,7 +2884,7 @@
                     <pic:cNvPicPr/>
                   </pic:nvPicPr>
                   <pic:blipFill>
-                    <a:blip r:embed="rId35"/>
+                    <a:blip r:embed="rId37"/>
                     <a:stretch>
                       <a:fillRect/>
                     </a:stretch>
@@ -2964,7 +2964,7 @@
                     <pic:cNvPicPr/>
                   </pic:nvPicPr>
                   <pic:blipFill>
-                    <a:blip r:embed="rId36"/>
+                    <a:blip r:embed="rId38"/>
                     <a:stretch>
                       <a:fillRect/>
                     </a:stretch>
@@ -3063,7 +3063,7 @@
                           <pic:cNvPicPr/>
                         </pic:nvPicPr>
                         <pic:blipFill>
-                          <a:blip r:embed="rId37"/>
+                          <a:blip r:embed="rId39"/>
                           <a:stretch>
                             <a:fillRect/>
                           </a:stretch>
@@ -3141,7 +3141,7 @@
                           <pic:cNvPicPr/>
                         </pic:nvPicPr>
                         <pic:blipFill>
-                          <a:blip r:embed="rId38"/>
+                          <a:blip r:embed="rId40"/>
                           <a:stretch>
                             <a:fillRect/>
                           </a:stretch>
@@ -3222,7 +3222,7 @@
                           <pic:cNvPicPr/>
                         </pic:nvPicPr>
                         <pic:blipFill>
-                          <a:blip r:embed="rId39"/>
+                          <a:blip r:embed="rId41"/>
                           <a:stretch>
                             <a:fillRect/>
                           </a:stretch>
@@ -3314,7 +3314,7 @@
                           <pic:cNvPicPr/>
                         </pic:nvPicPr>
                         <pic:blipFill>
-                          <a:blip r:embed="rId40"/>
+                          <a:blip r:embed="rId42"/>
                           <a:stretch>
                             <a:fillRect/>
                           </a:stretch>
@@ -3392,7 +3392,7 @@
                           <pic:cNvPicPr/>
                         </pic:nvPicPr>
                         <pic:blipFill>
-                          <a:blip r:embed="rId41"/>
+                          <a:blip r:embed="rId43"/>
                           <a:stretch>
                             <a:fillRect/>
                           </a:stretch>
@@ -3562,7 +3562,7 @@
           <w:color w:val="156082" w:themeColor="accent1"/>
         </w:rPr>
         <w:sectPr>
-          <w:headerReference w:type="default" r:id="rId42"/>
+          <w:headerReference w:type="default" r:id="rId44"/>
           <w:type w:val="continuous"/>
           <w:pgSz w:w="12240" w:h="15840"/>
           <w:pgMar w:top="1440" w:right="1440" w:bottom="1440" w:left="1440" w:header="720" w:footer="720" w:gutter="0"/>
@@ -3786,7 +3786,7 @@
                     <pic:cNvPicPr/>
                   </pic:nvPicPr>
                   <pic:blipFill>
-                    <a:blip r:embed="rId43"/>
+                    <a:blip r:embed="rId45"/>
                     <a:stretch>
                       <a:fillRect/>
                     </a:stretch>
@@ -3921,16 +3921,44 @@
       <w:r>
         <w:t xml:space="preserve"> </w:t>
       </w:r>
-      <w:r>
-        <w:rPr>
-          <w:b w:val="0"/>
-          <w:bCs/>
-          <w:color w:val="4EA72E" w:themeColor="accent6"/>
-          <w:position w:val="2"/>
-          <w:sz w:val="16"/>
-          <w:szCs w:val="16"/>
-        </w:rPr>
-        <w:t>(Arial 13.5 Bold, Outline Level 3 Header, Keep with next)</w:t>
+    </w:p>
+    <w:p>
+      <w:pPr>
+        <w:rPr>
+          <w:color w:val="0F9ED5" w:themeColor="accent4"/>
+        </w:rPr>
+      </w:pPr>
+      <w:r>
+        <w:rPr>
+          <w:color w:val="0F9ED5" w:themeColor="accent4"/>
+        </w:rPr>
+        <w:t xml:space="preserve">(Arial </w:t>
+      </w:r>
+      <w:r>
+        <w:rPr>
+          <w:b/>
+          <w:color w:val="0F9ED5" w:themeColor="accent4"/>
+        </w:rPr>
+        <w:t>12</w:t>
+      </w:r>
+      <w:r>
+        <w:rPr>
+          <w:color w:val="0F9ED5" w:themeColor="accent4"/>
+        </w:rPr>
+        <w:t xml:space="preserve"> Bold, Outline Level </w:t>
+      </w:r>
+      <w:r>
+        <w:rPr>
+          <w:b/>
+          <w:color w:val="0F9ED5" w:themeColor="accent4"/>
+        </w:rPr>
+        <w:t>4</w:t>
+      </w:r>
+      <w:r>
+        <w:rPr>
+          <w:color w:val="0F9ED5" w:themeColor="accent4"/>
+        </w:rPr>
+        <w:t xml:space="preserve"> Header, Keep with next)</w:t>
       </w:r>
     </w:p>
     <w:p>
@@ -4000,6 +4028,56 @@
     </w:sectPr>
   </w:body>
 </w:document>
+</file>
+
+<file path=word/endnotes.xml><?xml version="1.0" encoding="utf-8"?>
+<w:endnotes xmlns:wpc="http://schemas.microsoft.com/office/word/2010/wordprocessingCanvas" xmlns:cx="http://schemas.microsoft.com/office/drawing/2014/chartex" xmlns:cx1="http://schemas.microsoft.com/office/drawing/2015/9/8/chartex" xmlns:cx2="http://schemas.microsoft.com/office/drawing/2015/10/21/chartex" xmlns:cx3="http://schemas.microsoft.com/office/drawing/2016/5/9/chartex" xmlns:cx4="http://schemas.microsoft.com/office/drawing/2016/5/10/chartex" xmlns:cx5="http://schemas.microsoft.com/office/drawing/2016/5/11/chartex" xmlns:cx6="http://schemas.microsoft.com/office/drawing/2016/5/12/chartex" xmlns:cx7="http://schemas.microsoft.com/office/drawing/2016/5/13/chartex" xmlns:cx8="http://schemas.microsoft.com/office/drawing/2016/5/14/chartex" xmlns:mc="http://schemas.openxmlformats.org/markup-compatibility/2006" xmlns:aink="http://schemas.microsoft.com/office/drawing/2016/ink" xmlns:am3d="http://schemas.microsoft.com/office/drawing/2017/model3d" xmlns:o="urn:schemas-microsoft-com:office:office" xmlns:oel="http://schemas.microsoft.com/office/2019/extlst" xmlns:r="http://schemas.openxmlformats.org/officeDocument/2006/relationships" xmlns:m="http://schemas.openxmlformats.org/officeDocument/2006/math" xmlns:v="urn:schemas-microsoft-com:vml" xmlns:wp14="http://schemas.microsoft.com/office/word/2010/wordprocessingDrawing" xmlns:wp="http://schemas.openxmlformats.org/drawingml/2006/wordprocessingDrawing" xmlns:w10="urn:schemas-microsoft-com:office:word" xmlns:w="http://schemas.openxmlformats.org/wordprocessingml/2006/main" xmlns:w14="http://schemas.microsoft.com/office/word/2010/wordml" xmlns:w15="http://schemas.microsoft.com/office/word/2012/wordml" xmlns:w16cex="http://schemas.microsoft.com/office/word/2018/wordml/cex" xmlns:w16cid="http://schemas.microsoft.com/office/word/2016/wordml/cid" xmlns:w16="http://schemas.microsoft.com/office/word/2018/wordml" xmlns:w16du="http://schemas.microsoft.com/office/word/2023/wordml/word16du" xmlns:w16sdtdh="http://schemas.microsoft.com/office/word/2020/wordml/sdtdatahash" xmlns:w16sdtfl="http://schemas.microsoft.com/office/word/2024/wordml/sdtformatlock" xmlns:w16se="http://schemas.microsoft.com/office/word/2015/wordml/symex" xmlns:wpg="http://schemas.microsoft.com/office/word/2010/wordprocessingGroup" xmlns:wpi="http://schemas.microsoft.com/office/word/2010/wordprocessingInk" xmlns:wne="http://schemas.microsoft.com/office/word/2006/wordml" xmlns:wps="http://schemas.microsoft.com/office/word/2010/wordprocessingShape" mc:Ignorable="w14 w15 w16se w16cid w16 w16cex w16sdtdh w16sdtfl w16du wp14">
+  <w:endnote w:type="separator" w:id="-1">
+    <w:p>
+      <w:pPr>
+        <w:spacing w:line="240" w:lineRule="auto"/>
+      </w:pPr>
+      <w:r>
+        <w:separator/>
+      </w:r>
+    </w:p>
+  </w:endnote>
+  <w:endnote w:type="continuationSeparator" w:id="0">
+    <w:p>
+      <w:pPr>
+        <w:spacing w:line="240" w:lineRule="auto"/>
+      </w:pPr>
+      <w:r>
+        <w:continuationSeparator/>
+      </w:r>
+    </w:p>
+  </w:endnote>
+</w:endnotes>
+</file>
+
+<file path=word/footnotes.xml><?xml version="1.0" encoding="utf-8"?>
+<w:footnotes xmlns:wpc="http://schemas.microsoft.com/office/word/2010/wordprocessingCanvas" xmlns:cx="http://schemas.microsoft.com/office/drawing/2014/chartex" xmlns:cx1="http://schemas.microsoft.com/office/drawing/2015/9/8/chartex" xmlns:cx2="http://schemas.microsoft.com/office/drawing/2015/10/21/chartex" xmlns:cx3="http://schemas.microsoft.com/office/drawing/2016/5/9/chartex" xmlns:cx4="http://schemas.microsoft.com/office/drawing/2016/5/10/chartex" xmlns:cx5="http://schemas.microsoft.com/office/drawing/2016/5/11/chartex" xmlns:cx6="http://schemas.microsoft.com/office/drawing/2016/5/12/chartex" xmlns:cx7="http://schemas.microsoft.com/office/drawing/2016/5/13/chartex" xmlns:cx8="http://schemas.microsoft.com/office/drawing/2016/5/14/chartex" xmlns:mc="http://schemas.openxmlformats.org/markup-compatibility/2006" xmlns:aink="http://schemas.microsoft.com/office/drawing/2016/ink" xmlns:am3d="http://schemas.microsoft.com/office/drawing/2017/model3d" xmlns:o="urn:schemas-microsoft-com:office:office" xmlns:oel="http://schemas.microsoft.com/office/2019/extlst" xmlns:r="http://schemas.openxmlformats.org/officeDocument/2006/relationships" xmlns:m="http://schemas.openxmlformats.org/officeDocument/2006/math" xmlns:v="urn:schemas-microsoft-com:vml" xmlns:wp14="http://schemas.microsoft.com/office/word/2010/wordprocessingDrawing" xmlns:wp="http://schemas.openxmlformats.org/drawingml/2006/wordprocessingDrawing" xmlns:w10="urn:schemas-microsoft-com:office:word" xmlns:w="http://schemas.openxmlformats.org/wordprocessingml/2006/main" xmlns:w14="http://schemas.microsoft.com/office/word/2010/wordml" xmlns:w15="http://schemas.microsoft.com/office/word/2012/wordml" xmlns:w16cex="http://schemas.microsoft.com/office/word/2018/wordml/cex" xmlns:w16cid="http://schemas.microsoft.com/office/word/2016/wordml/cid" xmlns:w16="http://schemas.microsoft.com/office/word/2018/wordml" xmlns:w16du="http://schemas.microsoft.com/office/word/2023/wordml/word16du" xmlns:w16sdtdh="http://schemas.microsoft.com/office/word/2020/wordml/sdtdatahash" xmlns:w16sdtfl="http://schemas.microsoft.com/office/word/2024/wordml/sdtformatlock" xmlns:w16se="http://schemas.microsoft.com/office/word/2015/wordml/symex" xmlns:wpg="http://schemas.microsoft.com/office/word/2010/wordprocessingGroup" xmlns:wpi="http://schemas.microsoft.com/office/word/2010/wordprocessingInk" xmlns:wne="http://schemas.microsoft.com/office/word/2006/wordml" xmlns:wps="http://schemas.microsoft.com/office/word/2010/wordprocessingShape" mc:Ignorable="w14 w15 w16se w16cid w16 w16cex w16sdtdh w16sdtfl w16du wp14">
+  <w:footnote w:type="separator" w:id="-1">
+    <w:p>
+      <w:pPr>
+        <w:spacing w:line="240" w:lineRule="auto"/>
+      </w:pPr>
+      <w:r>
+        <w:separator/>
+      </w:r>
+    </w:p>
+  </w:footnote>
+  <w:footnote w:type="continuationSeparator" w:id="0">
+    <w:p>
+      <w:pPr>
+        <w:spacing w:line="240" w:lineRule="auto"/>
+      </w:pPr>
+      <w:r>
+        <w:continuationSeparator/>
+      </w:r>
+    </w:p>
+  </w:footnote>
+</w:footnotes>
 </file>
 
 <file path=word/header1.xml><?xml version="1.0" encoding="utf-8"?>

</xml_diff>